<commit_message>
nmv 26 09 2026
</commit_message>
<xml_diff>
--- a/TS-Kramam/TS-4.3/TS 4.3 Malayalam Krama Paatam Corrections.docx
+++ b/TS-Kramam/TS-4.3/TS 4.3 Malayalam Krama Paatam Corrections.docx
@@ -1,6 +1,6 @@
 
 <file path=word/document.xml><?xml version="1.0" encoding="utf-8"?>
-<w:document xmlns:wpc="http://schemas.microsoft.com/office/word/2010/wordprocessingCanvas" xmlns:cx="http://schemas.microsoft.com/office/drawing/2014/chartex" xmlns:cx1="http://schemas.microsoft.com/office/drawing/2015/9/8/chartex" xmlns:cx2="http://schemas.microsoft.com/office/drawing/2015/10/21/chartex" xmlns:cx3="http://schemas.microsoft.com/office/drawing/2016/5/9/chartex" xmlns:cx4="http://schemas.microsoft.com/office/drawing/2016/5/10/chartex" xmlns:cx5="http://schemas.microsoft.com/office/drawing/2016/5/11/chartex" xmlns:cx6="http://schemas.microsoft.com/office/drawing/2016/5/12/chartex" xmlns:cx7="http://schemas.microsoft.com/office/drawing/2016/5/13/chartex" xmlns:cx8="http://schemas.microsoft.com/office/drawing/2016/5/14/chartex" xmlns:mc="http://schemas.openxmlformats.org/markup-compatibility/2006" xmlns:aink="http://schemas.microsoft.com/office/drawing/2016/ink" xmlns:am3d="http://schemas.microsoft.com/office/drawing/2017/model3d" xmlns:o="urn:schemas-microsoft-com:office:office" xmlns:oel="http://schemas.microsoft.com/office/2019/extlst" xmlns:r="http://schemas.openxmlformats.org/officeDocument/2006/relationships" xmlns:m="http://schemas.openxmlformats.org/officeDocument/2006/math" xmlns:v="urn:schemas-microsoft-com:vml" xmlns:wp14="http://schemas.microsoft.com/office/word/2010/wordprocessingDrawing" xmlns:wp="http://schemas.openxmlformats.org/drawingml/2006/wordprocessingDrawing" xmlns:w10="urn:schemas-microsoft-com:office:word" xmlns:w="http://schemas.openxmlformats.org/wordprocessingml/2006/main" xmlns:w14="http://schemas.microsoft.com/office/word/2010/wordml" xmlns:w15="http://schemas.microsoft.com/office/word/2012/wordml" xmlns:w16cei="http://schemas.microsoft.com/office/word/2026/wordml/cei" xmlns:w16cex="http://schemas.microsoft.com/office/word/2018/wordml/cex" xmlns:w16cid="http://schemas.microsoft.com/office/word/2016/wordml/cid" xmlns:w16="http://schemas.microsoft.com/office/word/2018/wordml" xmlns:w16du="http://schemas.microsoft.com/office/word/2023/wordml/word16du" xmlns:w16sdtdh="http://schemas.microsoft.com/office/word/2020/wordml/sdtdatahash" xmlns:w16sdtfl="http://schemas.microsoft.com/office/word/2024/wordml/sdtformatlock" xmlns:w16se="http://schemas.microsoft.com/office/word/2015/wordml/symex" xmlns:wpg="http://schemas.microsoft.com/office/word/2010/wordprocessingGroup" xmlns:wpi="http://schemas.microsoft.com/office/word/2010/wordprocessingInk" xmlns:wne="http://schemas.microsoft.com/office/word/2006/wordml" xmlns:wps="http://schemas.microsoft.com/office/word/2010/wordprocessingShape" mc:Ignorable="w14 w15 w16se w16cid w16 w16cex w16sdtdh w16sdtfl w16du wp14">
+<w:document xmlns:wpc="http://schemas.microsoft.com/office/word/2010/wordprocessingCanvas" xmlns:cx="http://schemas.microsoft.com/office/drawing/2014/chartex" xmlns:cx1="http://schemas.microsoft.com/office/drawing/2015/9/8/chartex" xmlns:cx2="http://schemas.microsoft.com/office/drawing/2015/10/21/chartex" xmlns:cx3="http://schemas.microsoft.com/office/drawing/2016/5/9/chartex" xmlns:cx4="http://schemas.microsoft.com/office/drawing/2016/5/10/chartex" xmlns:cx5="http://schemas.microsoft.com/office/drawing/2016/5/11/chartex" xmlns:cx6="http://schemas.microsoft.com/office/drawing/2016/5/12/chartex" xmlns:cx7="http://schemas.microsoft.com/office/drawing/2016/5/13/chartex" xmlns:cx8="http://schemas.microsoft.com/office/drawing/2016/5/14/chartex" xmlns:mc="http://schemas.openxmlformats.org/markup-compatibility/2006" xmlns:aink="http://schemas.microsoft.com/office/drawing/2016/ink" xmlns:am3d="http://schemas.microsoft.com/office/drawing/2017/model3d" xmlns:o="urn:schemas-microsoft-com:office:office" xmlns:oel="http://schemas.microsoft.com/office/2019/extlst" xmlns:r="http://schemas.openxmlformats.org/officeDocument/2006/relationships" xmlns:m="http://schemas.openxmlformats.org/officeDocument/2006/math" xmlns:v="urn:schemas-microsoft-com:vml" xmlns:wp14="http://schemas.microsoft.com/office/word/2010/wordprocessingDrawing" xmlns:wp="http://schemas.openxmlformats.org/drawingml/2006/wordprocessingDrawing" xmlns:w10="urn:schemas-microsoft-com:office:word" xmlns:w="http://schemas.openxmlformats.org/wordprocessingml/2006/main" xmlns:w14="http://schemas.microsoft.com/office/word/2010/wordml" xmlns:w15="http://schemas.microsoft.com/office/word/2012/wordml" xmlns:w16cex="http://schemas.microsoft.com/office/word/2018/wordml/cex" xmlns:w16cid="http://schemas.microsoft.com/office/word/2016/wordml/cid" xmlns:w16="http://schemas.microsoft.com/office/word/2018/wordml" xmlns:w16du="http://schemas.microsoft.com/office/word/2023/wordml/word16du" xmlns:w16sdtdh="http://schemas.microsoft.com/office/word/2020/wordml/sdtdatahash" xmlns:w16sdtfl="http://schemas.microsoft.com/office/word/2024/wordml/sdtformatlock" xmlns:w16se="http://schemas.microsoft.com/office/word/2015/wordml/symex" xmlns:wpg="http://schemas.microsoft.com/office/word/2010/wordprocessingGroup" xmlns:wpi="http://schemas.microsoft.com/office/word/2010/wordprocessingInk" xmlns:wne="http://schemas.microsoft.com/office/word/2006/wordml" xmlns:wps="http://schemas.microsoft.com/office/word/2010/wordprocessingShape" mc:Ignorable="w14 w15 w16se w16cid w16 w16cex w16sdtdh w16sdtfl w16du wp14">
   <w:body>
     <w:p>
       <w:pPr>
@@ -81,18 +81,7 @@
           <w:szCs w:val="32"/>
           <w:u w:val="single"/>
         </w:rPr>
-        <w:t xml:space="preserve">Observed </w:t>
-      </w:r>
-      <w:proofErr w:type="gramStart"/>
-      <w:r>
-        <w:rPr>
-          <w:b/>
-          <w:bCs/>
-          <w:sz w:val="32"/>
-          <w:szCs w:val="32"/>
-          <w:u w:val="single"/>
-        </w:rPr>
-        <w:t xml:space="preserve">till </w:t>
+        <w:t xml:space="preserve">Observed till </w:t>
       </w:r>
       <w:r>
         <w:rPr>
@@ -105,7 +94,6 @@
         </w:rPr>
         <w:t>????</w:t>
       </w:r>
-      <w:proofErr w:type="gramEnd"/>
     </w:p>
     <w:p>
       <w:pPr>
@@ -685,6 +673,468 @@
       </w:tr>
       <w:tr>
         <w:trPr>
+          <w:trHeight w:val="1421"/>
+        </w:trPr>
+        <w:tc>
+          <w:tcPr>
+            <w:tcW w:w="3906" w:type="dxa"/>
+            <w:tcBorders>
+              <w:top w:val="single" w:sz="4" w:space="0" w:color="000000"/>
+              <w:left w:val="single" w:sz="4" w:space="0" w:color="000000"/>
+              <w:bottom w:val="single" w:sz="4" w:space="0" w:color="000000"/>
+              <w:right w:val="single" w:sz="4" w:space="0" w:color="000000"/>
+            </w:tcBorders>
+          </w:tcPr>
+          <w:p>
+            <w:pPr>
+              <w:widowControl w:val="0"/>
+              <w:tabs>
+                <w:tab w:val="left" w:pos="993"/>
+              </w:tabs>
+              <w:autoSpaceDE w:val="0"/>
+              <w:autoSpaceDN w:val="0"/>
+              <w:adjustRightInd w:val="0"/>
+              <w:spacing w:before="0" w:line="240" w:lineRule="auto"/>
+              <w:ind w:right="297"/>
+              <w:rPr>
+                <w:rFonts w:cs="Arial"/>
+                <w:b/>
+                <w:sz w:val="28"/>
+                <w:szCs w:val="32"/>
+              </w:rPr>
+            </w:pPr>
+            <w:r>
+              <w:rPr>
+                <w:rFonts w:cs="Arial"/>
+                <w:b/>
+                <w:sz w:val="28"/>
+                <w:szCs w:val="32"/>
+              </w:rPr>
+              <w:t>T.S.4.3.</w:t>
+            </w:r>
+            <w:r>
+              <w:rPr>
+                <w:rFonts w:cs="Arial"/>
+                <w:b/>
+                <w:sz w:val="28"/>
+                <w:szCs w:val="32"/>
+              </w:rPr>
+              <w:t>6</w:t>
+            </w:r>
+            <w:r>
+              <w:rPr>
+                <w:rFonts w:cs="Arial"/>
+                <w:b/>
+                <w:sz w:val="28"/>
+                <w:szCs w:val="32"/>
+              </w:rPr>
+              <w:t>.</w:t>
+            </w:r>
+            <w:r>
+              <w:rPr>
+                <w:rFonts w:cs="Arial"/>
+                <w:b/>
+                <w:sz w:val="28"/>
+                <w:szCs w:val="32"/>
+              </w:rPr>
+              <w:t>1</w:t>
+            </w:r>
+            <w:r>
+              <w:rPr>
+                <w:rFonts w:cs="Arial"/>
+                <w:b/>
+                <w:sz w:val="28"/>
+                <w:szCs w:val="32"/>
+              </w:rPr>
+              <w:t xml:space="preserve"> – Kramam</w:t>
+            </w:r>
+          </w:p>
+          <w:p>
+            <w:pPr>
+              <w:widowControl w:val="0"/>
+              <w:tabs>
+                <w:tab w:val="left" w:pos="993"/>
+              </w:tabs>
+              <w:autoSpaceDE w:val="0"/>
+              <w:autoSpaceDN w:val="0"/>
+              <w:adjustRightInd w:val="0"/>
+              <w:spacing w:before="0" w:line="240" w:lineRule="auto"/>
+              <w:ind w:right="297"/>
+              <w:rPr>
+                <w:rFonts w:cs="Arial"/>
+                <w:b/>
+                <w:sz w:val="28"/>
+                <w:szCs w:val="32"/>
+                <w:lang w:val="it-IT"/>
+              </w:rPr>
+            </w:pPr>
+            <w:r>
+              <w:rPr>
+                <w:rFonts w:cs="Arial"/>
+                <w:b/>
+                <w:sz w:val="28"/>
+                <w:szCs w:val="32"/>
+                <w:lang w:val="it-IT"/>
+              </w:rPr>
+              <w:t xml:space="preserve">Krama Vaakyam No.– </w:t>
+            </w:r>
+            <w:r>
+              <w:rPr>
+                <w:rFonts w:cs="Arial"/>
+                <w:b/>
+                <w:sz w:val="28"/>
+                <w:szCs w:val="32"/>
+                <w:lang w:val="it-IT"/>
+              </w:rPr>
+              <w:t>35</w:t>
+            </w:r>
+          </w:p>
+          <w:p>
+            <w:pPr>
+              <w:widowControl w:val="0"/>
+              <w:tabs>
+                <w:tab w:val="left" w:pos="993"/>
+              </w:tabs>
+              <w:autoSpaceDE w:val="0"/>
+              <w:autoSpaceDN w:val="0"/>
+              <w:adjustRightInd w:val="0"/>
+              <w:spacing w:before="0" w:line="240" w:lineRule="auto"/>
+              <w:ind w:right="297"/>
+              <w:rPr>
+                <w:rFonts w:cs="Arial"/>
+                <w:b/>
+                <w:sz w:val="28"/>
+                <w:szCs w:val="32"/>
+                <w:lang w:val="it-IT"/>
+              </w:rPr>
+            </w:pPr>
+            <w:r>
+              <w:rPr>
+                <w:rFonts w:cs="Arial"/>
+                <w:b/>
+                <w:sz w:val="28"/>
+                <w:szCs w:val="32"/>
+                <w:lang w:val="it-IT"/>
+              </w:rPr>
+              <w:t>Panchaati No</w:t>
+            </w:r>
+            <w:r>
+              <w:rPr>
+                <w:rFonts w:cs="Arial"/>
+                <w:b/>
+                <w:szCs w:val="32"/>
+                <w:lang w:val="it-IT"/>
+              </w:rPr>
+              <w:t xml:space="preserve">. - </w:t>
+            </w:r>
+            <w:r>
+              <w:rPr>
+                <w:rFonts w:cs="Arial"/>
+                <w:b/>
+                <w:sz w:val="28"/>
+                <w:szCs w:val="32"/>
+                <w:lang w:val="it-IT"/>
+              </w:rPr>
+              <w:t>11</w:t>
+            </w:r>
+          </w:p>
+        </w:tc>
+        <w:tc>
+          <w:tcPr>
+            <w:tcW w:w="5103" w:type="dxa"/>
+            <w:tcBorders>
+              <w:top w:val="single" w:sz="4" w:space="0" w:color="000000"/>
+              <w:left w:val="single" w:sz="4" w:space="0" w:color="000000"/>
+              <w:bottom w:val="single" w:sz="4" w:space="0" w:color="000000"/>
+              <w:right w:val="single" w:sz="4" w:space="0" w:color="000000"/>
+            </w:tcBorders>
+          </w:tcPr>
+          <w:p>
+            <w:pPr>
+              <w:widowControl w:val="0"/>
+              <w:autoSpaceDE w:val="0"/>
+              <w:autoSpaceDN w:val="0"/>
+              <w:adjustRightInd w:val="0"/>
+              <w:spacing w:before="0" w:line="240" w:lineRule="auto"/>
+              <w:rPr>
+                <w:rFonts w:ascii="BRH Malayalam Extra" w:hAnsi="BRH Malayalam Extra" w:cs="BRH Malayalam Extra"/>
+                <w:color w:val="000000"/>
+                <w:sz w:val="40"/>
+                <w:szCs w:val="40"/>
+              </w:rPr>
+            </w:pPr>
+            <w:r>
+              <w:rPr>
+                <w:rFonts w:ascii="BRH Malayalam Extra" w:hAnsi="BRH Malayalam Extra" w:cs="BRH Malayalam Extra"/>
+                <w:color w:val="000000"/>
+                <w:sz w:val="40"/>
+                <w:szCs w:val="40"/>
+              </w:rPr>
+              <w:t>A</w:t>
+            </w:r>
+            <w:r>
+              <w:rPr>
+                <w:rFonts w:ascii="BRH Malayalam Extra" w:hAnsi="BRH Malayalam Extra" w:cs="BRH Malayalam Extra"/>
+                <w:color w:val="000000"/>
+                <w:sz w:val="32"/>
+                <w:szCs w:val="40"/>
+              </w:rPr>
+              <w:t>–</w:t>
+            </w:r>
+            <w:r>
+              <w:rPr>
+                <w:rFonts w:ascii="BRH Malayalam Extra" w:hAnsi="BRH Malayalam Extra" w:cs="BRH Malayalam Extra"/>
+                <w:color w:val="000000"/>
+                <w:sz w:val="40"/>
+                <w:szCs w:val="40"/>
+              </w:rPr>
+              <w:t xml:space="preserve">Çky—±I </w:t>
+            </w:r>
+            <w:r>
+              <w:rPr>
+                <w:rFonts w:ascii="BRH Devanagari RN" w:hAnsi="BRH Devanagari RN" w:cs="BRH Malayalam Extra"/>
+                <w:color w:val="000000"/>
+                <w:sz w:val="32"/>
+                <w:szCs w:val="40"/>
+              </w:rPr>
+              <w:t>Æ</w:t>
+            </w:r>
+            <w:r>
+              <w:rPr>
+                <w:rFonts w:ascii="BRH Malayalam Extra" w:hAnsi="BRH Malayalam Extra" w:cs="BRH Malayalam Extra"/>
+                <w:color w:val="000000"/>
+                <w:sz w:val="40"/>
+                <w:szCs w:val="40"/>
+              </w:rPr>
+              <w:t xml:space="preserve">jPâ | </w:t>
+            </w:r>
+          </w:p>
+          <w:p>
+            <w:pPr>
+              <w:widowControl w:val="0"/>
+              <w:autoSpaceDE w:val="0"/>
+              <w:autoSpaceDN w:val="0"/>
+              <w:adjustRightInd w:val="0"/>
+              <w:spacing w:before="0" w:line="240" w:lineRule="auto"/>
+              <w:rPr>
+                <w:rFonts w:ascii="BRH Malayalam Extra" w:hAnsi="BRH Malayalam Extra" w:cs="BRH Malayalam Extra"/>
+                <w:color w:val="000000"/>
+                <w:sz w:val="40"/>
+                <w:szCs w:val="40"/>
+                <w:lang w:val="it-IT"/>
+              </w:rPr>
+            </w:pPr>
+            <w:r>
+              <w:rPr>
+                <w:rFonts w:ascii="BRH Malayalam Extra" w:hAnsi="BRH Malayalam Extra" w:cs="BRH Malayalam Extra"/>
+                <w:color w:val="000000"/>
+                <w:sz w:val="40"/>
+                <w:szCs w:val="40"/>
+                <w:highlight w:val="yellow"/>
+              </w:rPr>
+              <w:t>j</w:t>
+            </w:r>
+            <w:r>
+              <w:rPr>
+                <w:rFonts w:ascii="BRH Malayalam Extra" w:hAnsi="BRH Malayalam Extra" w:cs="BRH Malayalam Extra"/>
+                <w:color w:val="000000"/>
+                <w:sz w:val="40"/>
+                <w:szCs w:val="40"/>
+              </w:rPr>
+              <w:t>Pâx</w:t>
+            </w:r>
+            <w:r>
+              <w:rPr>
+                <w:rFonts w:ascii="BRH Malayalam Extra" w:hAnsi="BRH Malayalam Extra" w:cs="BRH Malayalam Extra"/>
+                <w:color w:val="000000"/>
+                <w:sz w:val="32"/>
+                <w:szCs w:val="40"/>
+              </w:rPr>
+              <w:t>–</w:t>
+            </w:r>
+            <w:r>
+              <w:rPr>
+                <w:rFonts w:ascii="BRH Malayalam Extra" w:hAnsi="BRH Malayalam Extra" w:cs="BRH Malayalam Extra"/>
+                <w:color w:val="000000"/>
+                <w:sz w:val="40"/>
+                <w:szCs w:val="40"/>
+              </w:rPr>
+              <w:t>Çky—±</w:t>
+            </w:r>
+            <w:r>
+              <w:rPr>
+                <w:rFonts w:ascii="BRH Malayalam Extra" w:hAnsi="BRH Malayalam Extra" w:cs="BRH Malayalam Extra"/>
+                <w:color w:val="000000"/>
+                <w:sz w:val="40"/>
+                <w:szCs w:val="40"/>
+              </w:rPr>
+              <w:t>I</w:t>
+            </w:r>
+            <w:r>
+              <w:rPr>
+                <w:rFonts w:ascii="BRH Malayalam Extra" w:hAnsi="BRH Malayalam Extra" w:cs="BRH Malayalam Extra"/>
+                <w:color w:val="000000"/>
+                <w:sz w:val="40"/>
+                <w:szCs w:val="40"/>
+              </w:rPr>
+              <w:t xml:space="preserve"> |</w:t>
+            </w:r>
+          </w:p>
+        </w:tc>
+        <w:tc>
+          <w:tcPr>
+            <w:tcW w:w="5386" w:type="dxa"/>
+            <w:tcBorders>
+              <w:top w:val="single" w:sz="4" w:space="0" w:color="000000"/>
+              <w:left w:val="single" w:sz="4" w:space="0" w:color="000000"/>
+              <w:bottom w:val="single" w:sz="4" w:space="0" w:color="000000"/>
+              <w:right w:val="single" w:sz="4" w:space="0" w:color="000000"/>
+            </w:tcBorders>
+          </w:tcPr>
+          <w:p>
+            <w:pPr>
+              <w:widowControl w:val="0"/>
+              <w:autoSpaceDE w:val="0"/>
+              <w:autoSpaceDN w:val="0"/>
+              <w:adjustRightInd w:val="0"/>
+              <w:spacing w:before="0" w:line="240" w:lineRule="auto"/>
+              <w:rPr>
+                <w:rFonts w:ascii="BRH Malayalam Extra" w:hAnsi="BRH Malayalam Extra" w:cs="BRH Malayalam Extra"/>
+                <w:color w:val="000000"/>
+                <w:sz w:val="40"/>
+                <w:szCs w:val="40"/>
+              </w:rPr>
+            </w:pPr>
+            <w:r>
+              <w:rPr>
+                <w:rFonts w:ascii="BRH Malayalam Extra" w:hAnsi="BRH Malayalam Extra" w:cs="BRH Malayalam Extra"/>
+                <w:color w:val="000000"/>
+                <w:sz w:val="40"/>
+                <w:szCs w:val="40"/>
+              </w:rPr>
+              <w:t>A</w:t>
+            </w:r>
+            <w:r>
+              <w:rPr>
+                <w:rFonts w:ascii="BRH Malayalam Extra" w:hAnsi="BRH Malayalam Extra" w:cs="BRH Malayalam Extra"/>
+                <w:color w:val="000000"/>
+                <w:sz w:val="32"/>
+                <w:szCs w:val="40"/>
+              </w:rPr>
+              <w:t>–</w:t>
+            </w:r>
+            <w:r>
+              <w:rPr>
+                <w:rFonts w:ascii="BRH Malayalam Extra" w:hAnsi="BRH Malayalam Extra" w:cs="BRH Malayalam Extra"/>
+                <w:color w:val="000000"/>
+                <w:sz w:val="40"/>
+                <w:szCs w:val="40"/>
+              </w:rPr>
+              <w:t xml:space="preserve">Çky—±I </w:t>
+            </w:r>
+            <w:r>
+              <w:rPr>
+                <w:rFonts w:ascii="BRH Devanagari RN" w:hAnsi="BRH Devanagari RN" w:cs="BRH Malayalam Extra"/>
+                <w:color w:val="000000"/>
+                <w:sz w:val="32"/>
+                <w:szCs w:val="40"/>
+              </w:rPr>
+              <w:t>Æ</w:t>
+            </w:r>
+            <w:r>
+              <w:rPr>
+                <w:rFonts w:ascii="BRH Malayalam Extra" w:hAnsi="BRH Malayalam Extra" w:cs="BRH Malayalam Extra"/>
+                <w:color w:val="000000"/>
+                <w:sz w:val="40"/>
+                <w:szCs w:val="40"/>
+              </w:rPr>
+              <w:t xml:space="preserve">jPâ | </w:t>
+            </w:r>
+          </w:p>
+          <w:p>
+            <w:pPr>
+              <w:widowControl w:val="0"/>
+              <w:autoSpaceDE w:val="0"/>
+              <w:autoSpaceDN w:val="0"/>
+              <w:adjustRightInd w:val="0"/>
+              <w:spacing w:before="0" w:line="240" w:lineRule="auto"/>
+              <w:rPr>
+                <w:rFonts w:ascii="BRH Malayalam Extra" w:hAnsi="BRH Malayalam Extra" w:cs="BRH Malayalam Extra"/>
+                <w:color w:val="000000"/>
+                <w:sz w:val="40"/>
+                <w:szCs w:val="40"/>
+                <w:lang w:val="it-IT"/>
+              </w:rPr>
+            </w:pPr>
+            <w:r>
+              <w:rPr>
+                <w:rFonts w:ascii="BRH Malayalam Extra" w:hAnsi="BRH Malayalam Extra" w:cs="BRH Malayalam Extra"/>
+                <w:color w:val="000000"/>
+                <w:sz w:val="40"/>
+                <w:szCs w:val="40"/>
+                <w:highlight w:val="green"/>
+              </w:rPr>
+              <w:t>j</w:t>
+            </w:r>
+            <w:r>
+              <w:rPr>
+                <w:rFonts w:ascii="BRH Malayalam Extra" w:hAnsi="BRH Malayalam Extra" w:cs="BRH Malayalam Extra"/>
+                <w:color w:val="000000"/>
+                <w:sz w:val="32"/>
+                <w:szCs w:val="40"/>
+              </w:rPr>
+              <w:t>–</w:t>
+            </w:r>
+            <w:r>
+              <w:rPr>
+                <w:rFonts w:ascii="BRH Malayalam Extra" w:hAnsi="BRH Malayalam Extra" w:cs="BRH Malayalam Extra"/>
+                <w:color w:val="000000"/>
+                <w:sz w:val="40"/>
+                <w:szCs w:val="40"/>
+              </w:rPr>
+              <w:t>Pâx</w:t>
+            </w:r>
+            <w:r>
+              <w:rPr>
+                <w:rFonts w:ascii="BRH Malayalam Extra" w:hAnsi="BRH Malayalam Extra" w:cs="BRH Malayalam Extra"/>
+                <w:color w:val="000000"/>
+                <w:sz w:val="32"/>
+                <w:szCs w:val="40"/>
+              </w:rPr>
+              <w:t>–</w:t>
+            </w:r>
+            <w:r>
+              <w:rPr>
+                <w:rFonts w:ascii="BRH Malayalam Extra" w:hAnsi="BRH Malayalam Extra" w:cs="BRH Malayalam Extra"/>
+                <w:color w:val="000000"/>
+                <w:sz w:val="40"/>
+                <w:szCs w:val="40"/>
+              </w:rPr>
+              <w:t>Çky—±</w:t>
+            </w:r>
+            <w:r>
+              <w:rPr>
+                <w:rFonts w:ascii="BRH Malayalam Extra" w:hAnsi="BRH Malayalam Extra" w:cs="BRH Malayalam Extra"/>
+                <w:color w:val="000000"/>
+                <w:sz w:val="40"/>
+                <w:szCs w:val="40"/>
+              </w:rPr>
+              <w:t>I</w:t>
+            </w:r>
+            <w:r>
+              <w:rPr>
+                <w:rFonts w:ascii="BRH Malayalam Extra" w:hAnsi="BRH Malayalam Extra" w:cs="BRH Malayalam Extra"/>
+                <w:color w:val="000000"/>
+                <w:sz w:val="40"/>
+                <w:szCs w:val="40"/>
+              </w:rPr>
+              <w:t xml:space="preserve"> |</w:t>
+            </w:r>
+          </w:p>
+        </w:tc>
+      </w:tr>
+      <w:tr>
+        <w:trPr>
           <w:trHeight w:val="1563"/>
         </w:trPr>
         <w:tc>
@@ -731,25 +1181,7 @@
                 <w:sz w:val="28"/>
                 <w:szCs w:val="32"/>
               </w:rPr>
-              <w:t>10</w:t>
-            </w:r>
-            <w:r>
-              <w:rPr>
-                <w:rFonts w:cs="Arial"/>
-                <w:b/>
-                <w:sz w:val="28"/>
-                <w:szCs w:val="32"/>
-              </w:rPr>
-              <w:t>.</w:t>
-            </w:r>
-            <w:r>
-              <w:rPr>
-                <w:rFonts w:cs="Arial"/>
-                <w:b/>
-                <w:sz w:val="28"/>
-                <w:szCs w:val="32"/>
-              </w:rPr>
-              <w:t>3</w:t>
+              <w:t>10.3</w:t>
             </w:r>
             <w:r>
               <w:rPr>
@@ -777,28 +1209,18 @@
                 <w:b/>
                 <w:sz w:val="28"/>
                 <w:szCs w:val="32"/>
-                <w:lang w:val="it-IT"/>
-              </w:rPr>
-            </w:pPr>
-            <w:r>
-              <w:rPr>
-                <w:rFonts w:cs="Arial"/>
-                <w:b/>
-                <w:sz w:val="28"/>
-                <w:szCs w:val="32"/>
-                <w:lang w:val="it-IT"/>
-              </w:rPr>
-              <w:t xml:space="preserve">Krama Vaakyam No.– </w:t>
-            </w:r>
-            <w:r>
-              <w:rPr>
-                <w:rFonts w:cs="Arial"/>
-                <w:b/>
-                <w:sz w:val="28"/>
-                <w:szCs w:val="32"/>
-                <w:lang w:val="it-IT"/>
-              </w:rPr>
-              <w:t>20</w:t>
+                <w:lang w:val="en-IN"/>
+              </w:rPr>
+            </w:pPr>
+            <w:r>
+              <w:rPr>
+                <w:rFonts w:cs="Arial"/>
+                <w:b/>
+                <w:sz w:val="28"/>
+                <w:szCs w:val="32"/>
+                <w:lang w:val="en-IN"/>
+              </w:rPr>
+              <w:t>Krama Vaakyam No.– 20</w:t>
             </w:r>
           </w:p>
           <w:p>
@@ -873,14 +1295,16 @@
                 <w:color w:val="000000"/>
                 <w:sz w:val="40"/>
                 <w:szCs w:val="40"/>
-              </w:rPr>
-            </w:pPr>
-            <w:r>
-              <w:rPr>
-                <w:rFonts w:ascii="BRH Malayalam Extra" w:hAnsi="BRH Malayalam Extra" w:cs="BRH Malayalam Extra"/>
-                <w:color w:val="000000"/>
-                <w:sz w:val="40"/>
-                <w:szCs w:val="40"/>
+                <w:lang w:val="it-IT"/>
+              </w:rPr>
+            </w:pPr>
+            <w:r>
+              <w:rPr>
+                <w:rFonts w:ascii="BRH Malayalam Extra" w:hAnsi="BRH Malayalam Extra" w:cs="BRH Malayalam Extra"/>
+                <w:color w:val="000000"/>
+                <w:sz w:val="40"/>
+                <w:szCs w:val="40"/>
+                <w:lang w:val="it-IT"/>
               </w:rPr>
               <w:t>Acy—eZy</w:t>
             </w:r>
@@ -890,15 +1314,17 @@
                 <w:color w:val="000000"/>
                 <w:sz w:val="32"/>
                 <w:szCs w:val="40"/>
-              </w:rPr>
-              <w:t>–</w:t>
-            </w:r>
-            <w:r>
-              <w:rPr>
-                <w:rFonts w:ascii="BRH Malayalam Extra" w:hAnsi="BRH Malayalam Extra" w:cs="BRH Malayalam Extra"/>
-                <w:color w:val="000000"/>
-                <w:sz w:val="40"/>
-                <w:szCs w:val="40"/>
+                <w:lang w:val="it-IT"/>
+              </w:rPr>
+              <w:t>–</w:t>
+            </w:r>
+            <w:r>
+              <w:rPr>
+                <w:rFonts w:ascii="BRH Malayalam Extra" w:hAnsi="BRH Malayalam Extra" w:cs="BRH Malayalam Extra"/>
+                <w:color w:val="000000"/>
+                <w:sz w:val="40"/>
+                <w:szCs w:val="40"/>
+                <w:lang w:val="it-IT"/>
               </w:rPr>
               <w:t>kZõcy— - e</w:t>
             </w:r>
@@ -908,15 +1334,17 @@
                 <w:color w:val="000000"/>
                 <w:sz w:val="32"/>
                 <w:szCs w:val="40"/>
-              </w:rPr>
-              <w:t>–</w:t>
-            </w:r>
-            <w:r>
-              <w:rPr>
-                <w:rFonts w:ascii="BRH Malayalam Extra" w:hAnsi="BRH Malayalam Extra" w:cs="BRH Malayalam Extra"/>
-                <w:color w:val="000000"/>
-                <w:sz w:val="40"/>
-                <w:szCs w:val="40"/>
+                <w:lang w:val="it-IT"/>
+              </w:rPr>
+              <w:t>–</w:t>
+            </w:r>
+            <w:r>
+              <w:rPr>
+                <w:rFonts w:ascii="BRH Malayalam Extra" w:hAnsi="BRH Malayalam Extra" w:cs="BRH Malayalam Extra"/>
+                <w:color w:val="000000"/>
+                <w:sz w:val="40"/>
+                <w:szCs w:val="40"/>
+                <w:lang w:val="it-IT"/>
               </w:rPr>
               <w:t>Zy</w:t>
             </w:r>
@@ -926,15 +1354,17 @@
                 <w:color w:val="000000"/>
                 <w:sz w:val="32"/>
                 <w:szCs w:val="40"/>
-              </w:rPr>
-              <w:t>–</w:t>
-            </w:r>
-            <w:r>
-              <w:rPr>
-                <w:rFonts w:ascii="BRH Malayalam Extra" w:hAnsi="BRH Malayalam Extra" w:cs="BRH Malayalam Extra"/>
-                <w:color w:val="000000"/>
-                <w:sz w:val="40"/>
-                <w:szCs w:val="40"/>
+                <w:lang w:val="it-IT"/>
+              </w:rPr>
+              <w:t>–</w:t>
+            </w:r>
+            <w:r>
+              <w:rPr>
+                <w:rFonts w:ascii="BRH Malayalam Extra" w:hAnsi="BRH Malayalam Extra" w:cs="BRH Malayalam Extra"/>
+                <w:color w:val="000000"/>
+                <w:sz w:val="40"/>
+                <w:szCs w:val="40"/>
+                <w:lang w:val="it-IT"/>
               </w:rPr>
               <w:t>J | B</w:t>
             </w:r>
@@ -944,15 +1374,17 @@
                 <w:color w:val="000000"/>
                 <w:sz w:val="32"/>
                 <w:szCs w:val="40"/>
-              </w:rPr>
-              <w:t>–</w:t>
-            </w:r>
-            <w:r>
-              <w:rPr>
-                <w:rFonts w:ascii="BRH Malayalam Extra" w:hAnsi="BRH Malayalam Extra" w:cs="BRH Malayalam Extra"/>
-                <w:color w:val="000000"/>
-                <w:sz w:val="40"/>
-                <w:szCs w:val="40"/>
+                <w:lang w:val="it-IT"/>
+              </w:rPr>
+              <w:t>–</w:t>
+            </w:r>
+            <w:r>
+              <w:rPr>
+                <w:rFonts w:ascii="BRH Malayalam Extra" w:hAnsi="BRH Malayalam Extra" w:cs="BRH Malayalam Extra"/>
+                <w:color w:val="000000"/>
+                <w:sz w:val="40"/>
+                <w:szCs w:val="40"/>
+                <w:lang w:val="it-IT"/>
               </w:rPr>
               <w:t>sz</w:t>
             </w:r>
@@ -962,15 +1394,17 @@
                 <w:color w:val="000000"/>
                 <w:sz w:val="32"/>
                 <w:szCs w:val="40"/>
-              </w:rPr>
-              <w:t>–</w:t>
-            </w:r>
-            <w:r>
-              <w:rPr>
-                <w:rFonts w:ascii="BRH Malayalam Extra" w:hAnsi="BRH Malayalam Extra" w:cs="BRH Malayalam Extra"/>
-                <w:color w:val="000000"/>
-                <w:sz w:val="40"/>
-                <w:szCs w:val="40"/>
+                <w:lang w:val="it-IT"/>
+              </w:rPr>
+              <w:t>–</w:t>
+            </w:r>
+            <w:r>
+              <w:rPr>
+                <w:rFonts w:ascii="BRH Malayalam Extra" w:hAnsi="BRH Malayalam Extra" w:cs="BRH Malayalam Extra"/>
+                <w:color w:val="000000"/>
+                <w:sz w:val="40"/>
+                <w:szCs w:val="40"/>
+                <w:lang w:val="it-IT"/>
               </w:rPr>
               <w:t>¥bK—öZy</w:t>
             </w:r>
@@ -980,6 +1414,7 @@
                 <w:color w:val="000000"/>
                 <w:sz w:val="36"/>
                 <w:szCs w:val="40"/>
+                <w:lang w:val="it-IT"/>
               </w:rPr>
               <w:t>óè</w:t>
             </w:r>
@@ -989,6 +1424,7 @@
                 <w:color w:val="000000"/>
                 <w:sz w:val="40"/>
                 <w:szCs w:val="40"/>
+                <w:lang w:val="it-IT"/>
               </w:rPr>
               <w:t>q</w:t>
             </w:r>
@@ -999,6 +1435,7 @@
                 <w:sz w:val="40"/>
                 <w:szCs w:val="40"/>
                 <w:highlight w:val="yellow"/>
+                <w:lang w:val="it-IT"/>
               </w:rPr>
               <w:t>Zx</w:t>
             </w:r>
@@ -1009,6 +1446,7 @@
                 <w:sz w:val="32"/>
                 <w:szCs w:val="40"/>
                 <w:highlight w:val="yellow"/>
+                <w:lang w:val="it-IT"/>
               </w:rPr>
               <w:t>–</w:t>
             </w:r>
@@ -1019,6 +1457,7 @@
                 <w:sz w:val="40"/>
                 <w:szCs w:val="40"/>
                 <w:highlight w:val="yellow"/>
+                <w:lang w:val="it-IT"/>
               </w:rPr>
               <w:t>J</w:t>
             </w:r>
@@ -1028,6 +1467,7 @@
                 <w:color w:val="000000"/>
                 <w:sz w:val="40"/>
                 <w:szCs w:val="40"/>
+                <w:lang w:val="it-IT"/>
               </w:rPr>
               <w:t xml:space="preserve"> |</w:t>
             </w:r>
@@ -1055,14 +1495,16 @@
                 <w:color w:val="000000"/>
                 <w:sz w:val="40"/>
                 <w:szCs w:val="40"/>
-              </w:rPr>
-            </w:pPr>
-            <w:r>
-              <w:rPr>
-                <w:rFonts w:ascii="BRH Malayalam Extra" w:hAnsi="BRH Malayalam Extra" w:cs="BRH Malayalam Extra"/>
-                <w:color w:val="000000"/>
-                <w:sz w:val="40"/>
-                <w:szCs w:val="40"/>
+                <w:lang w:val="it-IT"/>
+              </w:rPr>
+            </w:pPr>
+            <w:r>
+              <w:rPr>
+                <w:rFonts w:ascii="BRH Malayalam Extra" w:hAnsi="BRH Malayalam Extra" w:cs="BRH Malayalam Extra"/>
+                <w:color w:val="000000"/>
+                <w:sz w:val="40"/>
+                <w:szCs w:val="40"/>
+                <w:lang w:val="it-IT"/>
               </w:rPr>
               <w:t>Acy—eZy</w:t>
             </w:r>
@@ -1072,15 +1514,17 @@
                 <w:color w:val="000000"/>
                 <w:sz w:val="32"/>
                 <w:szCs w:val="40"/>
-              </w:rPr>
-              <w:t>–</w:t>
-            </w:r>
-            <w:r>
-              <w:rPr>
-                <w:rFonts w:ascii="BRH Malayalam Extra" w:hAnsi="BRH Malayalam Extra" w:cs="BRH Malayalam Extra"/>
-                <w:color w:val="000000"/>
-                <w:sz w:val="40"/>
-                <w:szCs w:val="40"/>
+                <w:lang w:val="it-IT"/>
+              </w:rPr>
+              <w:t>–</w:t>
+            </w:r>
+            <w:r>
+              <w:rPr>
+                <w:rFonts w:ascii="BRH Malayalam Extra" w:hAnsi="BRH Malayalam Extra" w:cs="BRH Malayalam Extra"/>
+                <w:color w:val="000000"/>
+                <w:sz w:val="40"/>
+                <w:szCs w:val="40"/>
+                <w:lang w:val="it-IT"/>
               </w:rPr>
               <w:t>kZõcy— - e</w:t>
             </w:r>
@@ -1090,15 +1534,17 @@
                 <w:color w:val="000000"/>
                 <w:sz w:val="32"/>
                 <w:szCs w:val="40"/>
-              </w:rPr>
-              <w:t>–</w:t>
-            </w:r>
-            <w:r>
-              <w:rPr>
-                <w:rFonts w:ascii="BRH Malayalam Extra" w:hAnsi="BRH Malayalam Extra" w:cs="BRH Malayalam Extra"/>
-                <w:color w:val="000000"/>
-                <w:sz w:val="40"/>
-                <w:szCs w:val="40"/>
+                <w:lang w:val="it-IT"/>
+              </w:rPr>
+              <w:t>–</w:t>
+            </w:r>
+            <w:r>
+              <w:rPr>
+                <w:rFonts w:ascii="BRH Malayalam Extra" w:hAnsi="BRH Malayalam Extra" w:cs="BRH Malayalam Extra"/>
+                <w:color w:val="000000"/>
+                <w:sz w:val="40"/>
+                <w:szCs w:val="40"/>
+                <w:lang w:val="it-IT"/>
               </w:rPr>
               <w:t>Zy</w:t>
             </w:r>
@@ -1108,15 +1554,17 @@
                 <w:color w:val="000000"/>
                 <w:sz w:val="32"/>
                 <w:szCs w:val="40"/>
-              </w:rPr>
-              <w:t>–</w:t>
-            </w:r>
-            <w:r>
-              <w:rPr>
-                <w:rFonts w:ascii="BRH Malayalam Extra" w:hAnsi="BRH Malayalam Extra" w:cs="BRH Malayalam Extra"/>
-                <w:color w:val="000000"/>
-                <w:sz w:val="40"/>
-                <w:szCs w:val="40"/>
+                <w:lang w:val="it-IT"/>
+              </w:rPr>
+              <w:t>–</w:t>
+            </w:r>
+            <w:r>
+              <w:rPr>
+                <w:rFonts w:ascii="BRH Malayalam Extra" w:hAnsi="BRH Malayalam Extra" w:cs="BRH Malayalam Extra"/>
+                <w:color w:val="000000"/>
+                <w:sz w:val="40"/>
+                <w:szCs w:val="40"/>
+                <w:lang w:val="it-IT"/>
               </w:rPr>
               <w:t xml:space="preserve">J | </w:t>
             </w:r>
@@ -1268,34 +1716,7 @@
                 <w:sz w:val="28"/>
                 <w:szCs w:val="32"/>
               </w:rPr>
-              <w:t>1</w:t>
-            </w:r>
-            <w:r>
-              <w:rPr>
-                <w:rFonts w:cs="Arial"/>
-                <w:b/>
-                <w:sz w:val="28"/>
-                <w:szCs w:val="32"/>
-              </w:rPr>
-              <w:t>1</w:t>
-            </w:r>
-            <w:r>
-              <w:rPr>
-                <w:rFonts w:cs="Arial"/>
-                <w:b/>
-                <w:sz w:val="28"/>
-                <w:szCs w:val="32"/>
-              </w:rPr>
-              <w:t>.</w:t>
-            </w:r>
-            <w:r>
-              <w:rPr>
-                <w:rFonts w:cs="Arial"/>
-                <w:b/>
-                <w:sz w:val="28"/>
-                <w:szCs w:val="32"/>
-              </w:rPr>
-              <w:t>5</w:t>
+              <w:t>11.5</w:t>
             </w:r>
             <w:r>
               <w:rPr>
@@ -1323,28 +1744,18 @@
                 <w:b/>
                 <w:sz w:val="28"/>
                 <w:szCs w:val="32"/>
-                <w:lang w:val="it-IT"/>
-              </w:rPr>
-            </w:pPr>
-            <w:r>
-              <w:rPr>
-                <w:rFonts w:cs="Arial"/>
-                <w:b/>
-                <w:sz w:val="28"/>
-                <w:szCs w:val="32"/>
-                <w:lang w:val="it-IT"/>
-              </w:rPr>
-              <w:t xml:space="preserve">Krama Vaakyam No.– </w:t>
-            </w:r>
-            <w:r>
-              <w:rPr>
-                <w:rFonts w:cs="Arial"/>
-                <w:b/>
-                <w:sz w:val="28"/>
-                <w:szCs w:val="32"/>
-                <w:lang w:val="it-IT"/>
-              </w:rPr>
-              <w:t>31</w:t>
+                <w:lang w:val="en-IN"/>
+              </w:rPr>
+            </w:pPr>
+            <w:r>
+              <w:rPr>
+                <w:rFonts w:cs="Arial"/>
+                <w:b/>
+                <w:sz w:val="28"/>
+                <w:szCs w:val="32"/>
+                <w:lang w:val="en-IN"/>
+              </w:rPr>
+              <w:t>Krama Vaakyam No.– 31</w:t>
             </w:r>
           </w:p>
           <w:p>
@@ -1393,17 +1804,7 @@
                 <w:szCs w:val="32"/>
                 <w:lang w:val="it-IT"/>
               </w:rPr>
-              <w:t>2</w:t>
-            </w:r>
-            <w:r>
-              <w:rPr>
-                <w:rFonts w:cs="Arial"/>
-                <w:b/>
-                <w:sz w:val="28"/>
-                <w:szCs w:val="32"/>
-                <w:lang w:val="it-IT"/>
-              </w:rPr>
-              <w:t>5</w:t>
+              <w:t>25</w:t>
             </w:r>
           </w:p>
         </w:tc>
@@ -1429,14 +1830,16 @@
                 <w:color w:val="000000"/>
                 <w:sz w:val="40"/>
                 <w:szCs w:val="40"/>
-              </w:rPr>
-            </w:pPr>
-            <w:r>
-              <w:rPr>
-                <w:rFonts w:ascii="BRH Malayalam Extra" w:hAnsi="BRH Malayalam Extra" w:cs="BRH Malayalam Extra"/>
-                <w:color w:val="000000"/>
-                <w:sz w:val="40"/>
-                <w:szCs w:val="40"/>
+                <w:lang w:val="it-IT"/>
+              </w:rPr>
+            </w:pPr>
+            <w:r>
+              <w:rPr>
+                <w:rFonts w:ascii="BRH Malayalam Extra" w:hAnsi="BRH Malayalam Extra" w:cs="BRH Malayalam Extra"/>
+                <w:color w:val="000000"/>
+                <w:sz w:val="40"/>
+                <w:szCs w:val="40"/>
+                <w:lang w:val="it-IT"/>
               </w:rPr>
               <w:t xml:space="preserve">ej—sûZz </w:t>
             </w:r>
@@ -1447,6 +1850,7 @@
                 <w:sz w:val="40"/>
                 <w:szCs w:val="40"/>
                 <w:highlight w:val="yellow"/>
+                <w:lang w:val="it-IT"/>
               </w:rPr>
               <w:t>c¡</w:t>
             </w:r>
@@ -1456,15 +1860,17 @@
                 <w:color w:val="000000"/>
                 <w:sz w:val="32"/>
                 <w:szCs w:val="40"/>
-              </w:rPr>
-              <w:t>–</w:t>
-            </w:r>
-            <w:r>
-              <w:rPr>
-                <w:rFonts w:ascii="BRH Malayalam Extra" w:hAnsi="BRH Malayalam Extra" w:cs="BRH Malayalam Extra"/>
-                <w:color w:val="000000"/>
-                <w:sz w:val="40"/>
-                <w:szCs w:val="40"/>
+                <w:lang w:val="it-IT"/>
+              </w:rPr>
+              <w:t>–</w:t>
+            </w:r>
+            <w:r>
+              <w:rPr>
+                <w:rFonts w:ascii="BRH Malayalam Extra" w:hAnsi="BRH Malayalam Extra" w:cs="BRH Malayalam Extra"/>
+                <w:color w:val="000000"/>
+                <w:sz w:val="40"/>
+                <w:szCs w:val="40"/>
+                <w:lang w:val="it-IT"/>
               </w:rPr>
               <w:t xml:space="preserve">±û | </w:t>
             </w:r>
@@ -1481,14 +1887,16 @@
                 <w:color w:val="000000"/>
                 <w:sz w:val="40"/>
                 <w:szCs w:val="40"/>
-              </w:rPr>
-            </w:pPr>
-            <w:r>
-              <w:rPr>
-                <w:rFonts w:ascii="BRH Malayalam Extra" w:hAnsi="BRH Malayalam Extra" w:cs="BRH Malayalam Extra"/>
-                <w:color w:val="000000"/>
-                <w:sz w:val="40"/>
-                <w:szCs w:val="40"/>
+                <w:lang w:val="it-IT"/>
+              </w:rPr>
+            </w:pPr>
+            <w:r>
+              <w:rPr>
+                <w:rFonts w:ascii="BRH Malayalam Extra" w:hAnsi="BRH Malayalam Extra" w:cs="BRH Malayalam Extra"/>
+                <w:color w:val="000000"/>
+                <w:sz w:val="40"/>
+                <w:szCs w:val="40"/>
+                <w:lang w:val="it-IT"/>
               </w:rPr>
               <w:t>c¡</w:t>
             </w:r>
@@ -1498,35 +1906,19 @@
                 <w:color w:val="000000"/>
                 <w:sz w:val="32"/>
                 <w:szCs w:val="40"/>
-              </w:rPr>
-              <w:t>–</w:t>
-            </w:r>
-            <w:r>
-              <w:rPr>
-                <w:rFonts w:ascii="BRH Malayalam Extra" w:hAnsi="BRH Malayalam Extra" w:cs="BRH Malayalam Extra"/>
-                <w:color w:val="000000"/>
-                <w:sz w:val="40"/>
-                <w:szCs w:val="40"/>
-              </w:rPr>
-              <w:t>¥±ûxÀ—kxi¡Àkx</w:t>
-            </w:r>
-            <w:r>
-              <w:rPr>
-                <w:rFonts w:ascii="BRH Malayalam Extra" w:hAnsi="BRH Malayalam Extra" w:cs="BRH Malayalam Extra"/>
-                <w:color w:val="000000"/>
-                <w:sz w:val="40"/>
-                <w:szCs w:val="40"/>
-              </w:rPr>
-              <w:t>I</w:t>
-            </w:r>
-            <w:r>
-              <w:rPr>
-                <w:rFonts w:ascii="BRH Malayalam Extra" w:hAnsi="BRH Malayalam Extra" w:cs="BRH Malayalam Extra"/>
-                <w:color w:val="000000"/>
-                <w:sz w:val="40"/>
-                <w:szCs w:val="40"/>
-              </w:rPr>
-              <w:t xml:space="preserve"> |</w:t>
+                <w:lang w:val="it-IT"/>
+              </w:rPr>
+              <w:t>–</w:t>
+            </w:r>
+            <w:r>
+              <w:rPr>
+                <w:rFonts w:ascii="BRH Malayalam Extra" w:hAnsi="BRH Malayalam Extra" w:cs="BRH Malayalam Extra"/>
+                <w:color w:val="000000"/>
+                <w:sz w:val="40"/>
+                <w:szCs w:val="40"/>
+                <w:lang w:val="it-IT"/>
+              </w:rPr>
+              <w:t>¥±ûxÀ—kxi¡ÀkxI |</w:t>
             </w:r>
           </w:p>
         </w:tc>
@@ -1552,14 +1944,16 @@
                 <w:color w:val="000000"/>
                 <w:sz w:val="40"/>
                 <w:szCs w:val="40"/>
-              </w:rPr>
-            </w:pPr>
-            <w:r>
-              <w:rPr>
-                <w:rFonts w:ascii="BRH Malayalam Extra" w:hAnsi="BRH Malayalam Extra" w:cs="BRH Malayalam Extra"/>
-                <w:color w:val="000000"/>
-                <w:sz w:val="40"/>
-                <w:szCs w:val="40"/>
+                <w:lang w:val="it-IT"/>
+              </w:rPr>
+            </w:pPr>
+            <w:r>
+              <w:rPr>
+                <w:rFonts w:ascii="BRH Malayalam Extra" w:hAnsi="BRH Malayalam Extra" w:cs="BRH Malayalam Extra"/>
+                <w:color w:val="000000"/>
+                <w:sz w:val="40"/>
+                <w:szCs w:val="40"/>
+                <w:lang w:val="it-IT"/>
               </w:rPr>
               <w:t xml:space="preserve">ej—sûZz </w:t>
             </w:r>
@@ -1570,6 +1964,7 @@
                 <w:sz w:val="40"/>
                 <w:szCs w:val="40"/>
                 <w:highlight w:val="green"/>
+                <w:lang w:val="it-IT"/>
               </w:rPr>
               <w:t>c¡</w:t>
             </w:r>
@@ -1579,6 +1974,7 @@
                 <w:color w:val="000000"/>
                 <w:sz w:val="40"/>
                 <w:szCs w:val="40"/>
+                <w:lang w:val="it-IT"/>
               </w:rPr>
               <w:t xml:space="preserve">±û | </w:t>
             </w:r>
@@ -1595,14 +1991,16 @@
                 <w:color w:val="000000"/>
                 <w:sz w:val="40"/>
                 <w:szCs w:val="40"/>
-              </w:rPr>
-            </w:pPr>
-            <w:r>
-              <w:rPr>
-                <w:rFonts w:ascii="BRH Malayalam Extra" w:hAnsi="BRH Malayalam Extra" w:cs="BRH Malayalam Extra"/>
-                <w:color w:val="000000"/>
-                <w:sz w:val="40"/>
-                <w:szCs w:val="40"/>
+                <w:lang w:val="it-IT"/>
+              </w:rPr>
+            </w:pPr>
+            <w:r>
+              <w:rPr>
+                <w:rFonts w:ascii="BRH Malayalam Extra" w:hAnsi="BRH Malayalam Extra" w:cs="BRH Malayalam Extra"/>
+                <w:color w:val="000000"/>
+                <w:sz w:val="40"/>
+                <w:szCs w:val="40"/>
+                <w:lang w:val="it-IT"/>
               </w:rPr>
               <w:t>c¡</w:t>
             </w:r>
@@ -1612,35 +2010,19 @@
                 <w:color w:val="000000"/>
                 <w:sz w:val="32"/>
                 <w:szCs w:val="40"/>
-              </w:rPr>
-              <w:t>–</w:t>
-            </w:r>
-            <w:r>
-              <w:rPr>
-                <w:rFonts w:ascii="BRH Malayalam Extra" w:hAnsi="BRH Malayalam Extra" w:cs="BRH Malayalam Extra"/>
-                <w:color w:val="000000"/>
-                <w:sz w:val="40"/>
-                <w:szCs w:val="40"/>
-              </w:rPr>
-              <w:t>¥±ûxÀ—kxi¡Àkx</w:t>
-            </w:r>
-            <w:r>
-              <w:rPr>
-                <w:rFonts w:ascii="BRH Malayalam Extra" w:hAnsi="BRH Malayalam Extra" w:cs="BRH Malayalam Extra"/>
-                <w:color w:val="000000"/>
-                <w:sz w:val="40"/>
-                <w:szCs w:val="40"/>
-              </w:rPr>
-              <w:t>I</w:t>
-            </w:r>
-            <w:r>
-              <w:rPr>
-                <w:rFonts w:ascii="BRH Malayalam Extra" w:hAnsi="BRH Malayalam Extra" w:cs="BRH Malayalam Extra"/>
-                <w:color w:val="000000"/>
-                <w:sz w:val="40"/>
-                <w:szCs w:val="40"/>
-              </w:rPr>
-              <w:t xml:space="preserve"> |</w:t>
+                <w:lang w:val="it-IT"/>
+              </w:rPr>
+              <w:t>–</w:t>
+            </w:r>
+            <w:r>
+              <w:rPr>
+                <w:rFonts w:ascii="BRH Malayalam Extra" w:hAnsi="BRH Malayalam Extra" w:cs="BRH Malayalam Extra"/>
+                <w:color w:val="000000"/>
+                <w:sz w:val="40"/>
+                <w:szCs w:val="40"/>
+                <w:lang w:val="it-IT"/>
+              </w:rPr>
+              <w:t>¥±ûxÀ—kxi¡ÀkxI |</w:t>
             </w:r>
           </w:p>
         </w:tc>
@@ -1655,6 +2037,7 @@
           <w:sz w:val="32"/>
           <w:szCs w:val="32"/>
           <w:u w:val="single"/>
+          <w:lang w:val="it-IT"/>
         </w:rPr>
       </w:pPr>
     </w:p>
@@ -1667,6 +2050,7 @@
           <w:sz w:val="32"/>
           <w:szCs w:val="32"/>
           <w:u w:val="single"/>
+          <w:lang w:val="it-IT"/>
         </w:rPr>
       </w:pPr>
     </w:p>
@@ -1776,6 +2160,7 @@
           <w:b/>
           <w:bCs/>
         </w:rPr>
+        <w:lastRenderedPageBreak/>
         <w:t>(ignore those which are already incorporated in your book’s version and date)</w:t>
       </w:r>
     </w:p>
@@ -1939,7 +2324,6 @@
                 <w:sz w:val="28"/>
                 <w:szCs w:val="32"/>
               </w:rPr>
-              <w:lastRenderedPageBreak/>
               <w:t>T.S.4.3.</w:t>
             </w:r>
             <w:r>
@@ -3561,6 +3945,7 @@
                 <w:sz w:val="32"/>
                 <w:szCs w:val="32"/>
               </w:rPr>
+              <w:lastRenderedPageBreak/>
               <w:t>Section, Paragraph</w:t>
             </w:r>
           </w:p>
@@ -3661,7 +4046,6 @@
                 <w:sz w:val="28"/>
                 <w:szCs w:val="32"/>
               </w:rPr>
-              <w:lastRenderedPageBreak/>
               <w:t>T.S.4.3.1.1 – Kramam</w:t>
             </w:r>
           </w:p>
@@ -5653,6 +6037,7 @@
                 <w:sz w:val="28"/>
                 <w:szCs w:val="32"/>
               </w:rPr>
+              <w:lastRenderedPageBreak/>
               <w:t>T.S.4.3.9.1 – Kramam</w:t>
             </w:r>
           </w:p>
@@ -5964,7 +6349,6 @@
                 <w:sz w:val="28"/>
                 <w:szCs w:val="32"/>
               </w:rPr>
-              <w:lastRenderedPageBreak/>
               <w:t>T.S.4.3.9.2 – Kramam</w:t>
             </w:r>
           </w:p>
@@ -8490,6 +8874,7 @@
                 <w:sz w:val="28"/>
                 <w:szCs w:val="32"/>
               </w:rPr>
+              <w:lastRenderedPageBreak/>
               <w:t>T.S.4.3.11.3 – Kramam</w:t>
             </w:r>
           </w:p>
@@ -8783,7 +9168,6 @@
                 <w:sz w:val="28"/>
                 <w:szCs w:val="32"/>
               </w:rPr>
-              <w:lastRenderedPageBreak/>
               <w:t>T.S.4.3.12.2 – Kramam</w:t>
             </w:r>
           </w:p>
@@ -10858,6 +11242,7 @@
                 <w:sz w:val="28"/>
                 <w:szCs w:val="32"/>
               </w:rPr>
+              <w:lastRenderedPageBreak/>
               <w:t>T.S.4.3.13.8 – Kramam</w:t>
             </w:r>
           </w:p>
@@ -11113,7 +11498,6 @@
                 <w:sz w:val="28"/>
                 <w:szCs w:val="32"/>
               </w:rPr>
-              <w:lastRenderedPageBreak/>
               <w:t>T.S.4.3.13.8 – Kramam</w:t>
             </w:r>
           </w:p>
@@ -11377,16 +11761,7 @@
           <w:bCs/>
           <w:sz w:val="32"/>
         </w:rPr>
-        <w:t xml:space="preserve">replaced </w:t>
-      </w:r>
-      <w:proofErr w:type="gramStart"/>
-      <w:r>
-        <w:rPr>
-          <w:b/>
-          <w:bCs/>
-          <w:sz w:val="32"/>
-        </w:rPr>
-        <w:t>with</w:t>
+        <w:t>replaced with</w:t>
       </w:r>
       <w:r>
         <w:rPr>
@@ -11408,7 +11783,6 @@
         </w:rPr>
         <w:t>"</w:t>
       </w:r>
-      <w:proofErr w:type="gramEnd"/>
       <w:r>
         <w:rPr>
           <w:rFonts w:ascii="BRH Malayalam" w:hAnsi="BRH Malayalam" w:cs="BRH Malayalam"/>
@@ -11420,7 +11794,6 @@
         </w:rPr>
         <w:t>q§T</w:t>
       </w:r>
-      <w:proofErr w:type="gramStart"/>
       <w:r>
         <w:rPr>
           <w:rFonts w:ascii="BRH Malayalam" w:hAnsi="BRH Malayalam" w:cs="BRH Malayalam"/>
@@ -11437,16 +11810,7 @@
           <w:bCs/>
           <w:sz w:val="32"/>
         </w:rPr>
-        <w:t>wherever</w:t>
-      </w:r>
-      <w:proofErr w:type="gramEnd"/>
-      <w:r>
-        <w:rPr>
-          <w:b/>
-          <w:bCs/>
-          <w:sz w:val="32"/>
-        </w:rPr>
-        <w:t xml:space="preserve"> applicable</w:t>
+        <w:t>wherever applicable</w:t>
       </w:r>
     </w:p>
     <w:p>
@@ -11858,7 +12222,7 @@
 </file>
 
 <file path=word/endnotes.xml><?xml version="1.0" encoding="utf-8"?>
-<w:endnotes xmlns:wpc="http://schemas.microsoft.com/office/word/2010/wordprocessingCanvas" xmlns:cx="http://schemas.microsoft.com/office/drawing/2014/chartex" xmlns:cx1="http://schemas.microsoft.com/office/drawing/2015/9/8/chartex" xmlns:cx2="http://schemas.microsoft.com/office/drawing/2015/10/21/chartex" xmlns:cx3="http://schemas.microsoft.com/office/drawing/2016/5/9/chartex" xmlns:cx4="http://schemas.microsoft.com/office/drawing/2016/5/10/chartex" xmlns:cx5="http://schemas.microsoft.com/office/drawing/2016/5/11/chartex" xmlns:cx6="http://schemas.microsoft.com/office/drawing/2016/5/12/chartex" xmlns:cx7="http://schemas.microsoft.com/office/drawing/2016/5/13/chartex" xmlns:cx8="http://schemas.microsoft.com/office/drawing/2016/5/14/chartex" xmlns:mc="http://schemas.openxmlformats.org/markup-compatibility/2006" xmlns:aink="http://schemas.microsoft.com/office/drawing/2016/ink" xmlns:am3d="http://schemas.microsoft.com/office/drawing/2017/model3d" xmlns:o="urn:schemas-microsoft-com:office:office" xmlns:oel="http://schemas.microsoft.com/office/2019/extlst" xmlns:r="http://schemas.openxmlformats.org/officeDocument/2006/relationships" xmlns:m="http://schemas.openxmlformats.org/officeDocument/2006/math" xmlns:v="urn:schemas-microsoft-com:vml" xmlns:wp14="http://schemas.microsoft.com/office/word/2010/wordprocessingDrawing" xmlns:wp="http://schemas.openxmlformats.org/drawingml/2006/wordprocessingDrawing" xmlns:w10="urn:schemas-microsoft-com:office:word" xmlns:w="http://schemas.openxmlformats.org/wordprocessingml/2006/main" xmlns:w14="http://schemas.microsoft.com/office/word/2010/wordml" xmlns:w15="http://schemas.microsoft.com/office/word/2012/wordml" xmlns:w16cei="http://schemas.microsoft.com/office/word/2026/wordml/cei" xmlns:w16cex="http://schemas.microsoft.com/office/word/2018/wordml/cex" xmlns:w16cid="http://schemas.microsoft.com/office/word/2016/wordml/cid" xmlns:w16="http://schemas.microsoft.com/office/word/2018/wordml" xmlns:w16du="http://schemas.microsoft.com/office/word/2023/wordml/word16du" xmlns:w16sdtdh="http://schemas.microsoft.com/office/word/2020/wordml/sdtdatahash" xmlns:w16sdtfl="http://schemas.microsoft.com/office/word/2024/wordml/sdtformatlock" xmlns:w16se="http://schemas.microsoft.com/office/word/2015/wordml/symex" xmlns:wpg="http://schemas.microsoft.com/office/word/2010/wordprocessingGroup" xmlns:wpi="http://schemas.microsoft.com/office/word/2010/wordprocessingInk" xmlns:wne="http://schemas.microsoft.com/office/word/2006/wordml" xmlns:wps="http://schemas.microsoft.com/office/word/2010/wordprocessingShape" mc:Ignorable="w14 w15 w16se w16cid w16 w16cex w16sdtdh w16sdtfl w16du wp14">
+<w:endnotes xmlns:wpc="http://schemas.microsoft.com/office/word/2010/wordprocessingCanvas" xmlns:cx="http://schemas.microsoft.com/office/drawing/2014/chartex" xmlns:cx1="http://schemas.microsoft.com/office/drawing/2015/9/8/chartex" xmlns:cx2="http://schemas.microsoft.com/office/drawing/2015/10/21/chartex" xmlns:cx3="http://schemas.microsoft.com/office/drawing/2016/5/9/chartex" xmlns:cx4="http://schemas.microsoft.com/office/drawing/2016/5/10/chartex" xmlns:cx5="http://schemas.microsoft.com/office/drawing/2016/5/11/chartex" xmlns:cx6="http://schemas.microsoft.com/office/drawing/2016/5/12/chartex" xmlns:cx7="http://schemas.microsoft.com/office/drawing/2016/5/13/chartex" xmlns:cx8="http://schemas.microsoft.com/office/drawing/2016/5/14/chartex" xmlns:mc="http://schemas.openxmlformats.org/markup-compatibility/2006" xmlns:aink="http://schemas.microsoft.com/office/drawing/2016/ink" xmlns:am3d="http://schemas.microsoft.com/office/drawing/2017/model3d" xmlns:o="urn:schemas-microsoft-com:office:office" xmlns:oel="http://schemas.microsoft.com/office/2019/extlst" xmlns:r="http://schemas.openxmlformats.org/officeDocument/2006/relationships" xmlns:m="http://schemas.openxmlformats.org/officeDocument/2006/math" xmlns:v="urn:schemas-microsoft-com:vml" xmlns:wp14="http://schemas.microsoft.com/office/word/2010/wordprocessingDrawing" xmlns:wp="http://schemas.openxmlformats.org/drawingml/2006/wordprocessingDrawing" xmlns:w10="urn:schemas-microsoft-com:office:word" xmlns:w="http://schemas.openxmlformats.org/wordprocessingml/2006/main" xmlns:w14="http://schemas.microsoft.com/office/word/2010/wordml" xmlns:w15="http://schemas.microsoft.com/office/word/2012/wordml" xmlns:w16cex="http://schemas.microsoft.com/office/word/2018/wordml/cex" xmlns:w16cid="http://schemas.microsoft.com/office/word/2016/wordml/cid" xmlns:w16="http://schemas.microsoft.com/office/word/2018/wordml" xmlns:w16du="http://schemas.microsoft.com/office/word/2023/wordml/word16du" xmlns:w16sdtdh="http://schemas.microsoft.com/office/word/2020/wordml/sdtdatahash" xmlns:w16sdtfl="http://schemas.microsoft.com/office/word/2024/wordml/sdtformatlock" xmlns:w16se="http://schemas.microsoft.com/office/word/2015/wordml/symex" xmlns:wpg="http://schemas.microsoft.com/office/word/2010/wordprocessingGroup" xmlns:wpi="http://schemas.microsoft.com/office/word/2010/wordprocessingInk" xmlns:wne="http://schemas.microsoft.com/office/word/2006/wordml" xmlns:wps="http://schemas.microsoft.com/office/word/2010/wordprocessingShape" mc:Ignorable="w14 w15 w16se w16cid w16 w16cex w16sdtdh w16sdtfl w16du wp14">
   <w:endnote w:type="separator" w:id="-1">
     <w:p>
       <w:pPr>
@@ -11883,7 +12247,7 @@
 </file>
 
 <file path=word/footer1.xml><?xml version="1.0" encoding="utf-8"?>
-<w:ftr xmlns:wpc="http://schemas.microsoft.com/office/word/2010/wordprocessingCanvas" xmlns:cx="http://schemas.microsoft.com/office/drawing/2014/chartex" xmlns:cx1="http://schemas.microsoft.com/office/drawing/2015/9/8/chartex" xmlns:cx2="http://schemas.microsoft.com/office/drawing/2015/10/21/chartex" xmlns:cx3="http://schemas.microsoft.com/office/drawing/2016/5/9/chartex" xmlns:cx4="http://schemas.microsoft.com/office/drawing/2016/5/10/chartex" xmlns:cx5="http://schemas.microsoft.com/office/drawing/2016/5/11/chartex" xmlns:cx6="http://schemas.microsoft.com/office/drawing/2016/5/12/chartex" xmlns:cx7="http://schemas.microsoft.com/office/drawing/2016/5/13/chartex" xmlns:cx8="http://schemas.microsoft.com/office/drawing/2016/5/14/chartex" xmlns:mc="http://schemas.openxmlformats.org/markup-compatibility/2006" xmlns:aink="http://schemas.microsoft.com/office/drawing/2016/ink" xmlns:am3d="http://schemas.microsoft.com/office/drawing/2017/model3d" xmlns:o="urn:schemas-microsoft-com:office:office" xmlns:oel="http://schemas.microsoft.com/office/2019/extlst" xmlns:r="http://schemas.openxmlformats.org/officeDocument/2006/relationships" xmlns:m="http://schemas.openxmlformats.org/officeDocument/2006/math" xmlns:v="urn:schemas-microsoft-com:vml" xmlns:wp14="http://schemas.microsoft.com/office/word/2010/wordprocessingDrawing" xmlns:wp="http://schemas.openxmlformats.org/drawingml/2006/wordprocessingDrawing" xmlns:w10="urn:schemas-microsoft-com:office:word" xmlns:w="http://schemas.openxmlformats.org/wordprocessingml/2006/main" xmlns:w14="http://schemas.microsoft.com/office/word/2010/wordml" xmlns:w15="http://schemas.microsoft.com/office/word/2012/wordml" xmlns:w16cei="http://schemas.microsoft.com/office/word/2026/wordml/cei" xmlns:w16cex="http://schemas.microsoft.com/office/word/2018/wordml/cex" xmlns:w16cid="http://schemas.microsoft.com/office/word/2016/wordml/cid" xmlns:w16="http://schemas.microsoft.com/office/word/2018/wordml" xmlns:w16du="http://schemas.microsoft.com/office/word/2023/wordml/word16du" xmlns:w16sdtdh="http://schemas.microsoft.com/office/word/2020/wordml/sdtdatahash" xmlns:w16sdtfl="http://schemas.microsoft.com/office/word/2024/wordml/sdtformatlock" xmlns:w16se="http://schemas.microsoft.com/office/word/2015/wordml/symex" xmlns:wpg="http://schemas.microsoft.com/office/word/2010/wordprocessingGroup" xmlns:wpi="http://schemas.microsoft.com/office/word/2010/wordprocessingInk" xmlns:wne="http://schemas.microsoft.com/office/word/2006/wordml" xmlns:wps="http://schemas.microsoft.com/office/word/2010/wordprocessingShape" mc:Ignorable="w14 w15 w16se w16cid w16 w16cex w16sdtdh w16sdtfl w16du wp14">
+<w:ftr xmlns:wpc="http://schemas.microsoft.com/office/word/2010/wordprocessingCanvas" xmlns:cx="http://schemas.microsoft.com/office/drawing/2014/chartex" xmlns:cx1="http://schemas.microsoft.com/office/drawing/2015/9/8/chartex" xmlns:cx2="http://schemas.microsoft.com/office/drawing/2015/10/21/chartex" xmlns:cx3="http://schemas.microsoft.com/office/drawing/2016/5/9/chartex" xmlns:cx4="http://schemas.microsoft.com/office/drawing/2016/5/10/chartex" xmlns:cx5="http://schemas.microsoft.com/office/drawing/2016/5/11/chartex" xmlns:cx6="http://schemas.microsoft.com/office/drawing/2016/5/12/chartex" xmlns:cx7="http://schemas.microsoft.com/office/drawing/2016/5/13/chartex" xmlns:cx8="http://schemas.microsoft.com/office/drawing/2016/5/14/chartex" xmlns:mc="http://schemas.openxmlformats.org/markup-compatibility/2006" xmlns:aink="http://schemas.microsoft.com/office/drawing/2016/ink" xmlns:am3d="http://schemas.microsoft.com/office/drawing/2017/model3d" xmlns:o="urn:schemas-microsoft-com:office:office" xmlns:oel="http://schemas.microsoft.com/office/2019/extlst" xmlns:r="http://schemas.openxmlformats.org/officeDocument/2006/relationships" xmlns:m="http://schemas.openxmlformats.org/officeDocument/2006/math" xmlns:v="urn:schemas-microsoft-com:vml" xmlns:wp14="http://schemas.microsoft.com/office/word/2010/wordprocessingDrawing" xmlns:wp="http://schemas.openxmlformats.org/drawingml/2006/wordprocessingDrawing" xmlns:w10="urn:schemas-microsoft-com:office:word" xmlns:w="http://schemas.openxmlformats.org/wordprocessingml/2006/main" xmlns:w14="http://schemas.microsoft.com/office/word/2010/wordml" xmlns:w15="http://schemas.microsoft.com/office/word/2012/wordml" xmlns:w16cex="http://schemas.microsoft.com/office/word/2018/wordml/cex" xmlns:w16cid="http://schemas.microsoft.com/office/word/2016/wordml/cid" xmlns:w16="http://schemas.microsoft.com/office/word/2018/wordml" xmlns:w16du="http://schemas.microsoft.com/office/word/2023/wordml/word16du" xmlns:w16sdtdh="http://schemas.microsoft.com/office/word/2020/wordml/sdtdatahash" xmlns:w16sdtfl="http://schemas.microsoft.com/office/word/2024/wordml/sdtformatlock" xmlns:w16se="http://schemas.microsoft.com/office/word/2015/wordml/symex" xmlns:wpg="http://schemas.microsoft.com/office/word/2010/wordprocessingGroup" xmlns:wpi="http://schemas.microsoft.com/office/word/2010/wordprocessingInk" xmlns:wne="http://schemas.microsoft.com/office/word/2006/wordml" xmlns:wps="http://schemas.microsoft.com/office/word/2010/wordprocessingShape" mc:Ignorable="w14 w15 w16se w16cid w16 w16cex w16sdtdh w16sdtfl w16du wp14">
   <w:p>
     <w:pPr>
       <w:pBdr>
@@ -12065,7 +12429,7 @@
 </file>
 
 <file path=word/footer2.xml><?xml version="1.0" encoding="utf-8"?>
-<w:ftr xmlns:wpc="http://schemas.microsoft.com/office/word/2010/wordprocessingCanvas" xmlns:cx="http://schemas.microsoft.com/office/drawing/2014/chartex" xmlns:cx1="http://schemas.microsoft.com/office/drawing/2015/9/8/chartex" xmlns:cx2="http://schemas.microsoft.com/office/drawing/2015/10/21/chartex" xmlns:cx3="http://schemas.microsoft.com/office/drawing/2016/5/9/chartex" xmlns:cx4="http://schemas.microsoft.com/office/drawing/2016/5/10/chartex" xmlns:cx5="http://schemas.microsoft.com/office/drawing/2016/5/11/chartex" xmlns:cx6="http://schemas.microsoft.com/office/drawing/2016/5/12/chartex" xmlns:cx7="http://schemas.microsoft.com/office/drawing/2016/5/13/chartex" xmlns:cx8="http://schemas.microsoft.com/office/drawing/2016/5/14/chartex" xmlns:mc="http://schemas.openxmlformats.org/markup-compatibility/2006" xmlns:aink="http://schemas.microsoft.com/office/drawing/2016/ink" xmlns:am3d="http://schemas.microsoft.com/office/drawing/2017/model3d" xmlns:o="urn:schemas-microsoft-com:office:office" xmlns:oel="http://schemas.microsoft.com/office/2019/extlst" xmlns:r="http://schemas.openxmlformats.org/officeDocument/2006/relationships" xmlns:m="http://schemas.openxmlformats.org/officeDocument/2006/math" xmlns:v="urn:schemas-microsoft-com:vml" xmlns:wp14="http://schemas.microsoft.com/office/word/2010/wordprocessingDrawing" xmlns:wp="http://schemas.openxmlformats.org/drawingml/2006/wordprocessingDrawing" xmlns:w10="urn:schemas-microsoft-com:office:word" xmlns:w="http://schemas.openxmlformats.org/wordprocessingml/2006/main" xmlns:w14="http://schemas.microsoft.com/office/word/2010/wordml" xmlns:w15="http://schemas.microsoft.com/office/word/2012/wordml" xmlns:w16cei="http://schemas.microsoft.com/office/word/2026/wordml/cei" xmlns:w16cex="http://schemas.microsoft.com/office/word/2018/wordml/cex" xmlns:w16cid="http://schemas.microsoft.com/office/word/2016/wordml/cid" xmlns:w16="http://schemas.microsoft.com/office/word/2018/wordml" xmlns:w16du="http://schemas.microsoft.com/office/word/2023/wordml/word16du" xmlns:w16sdtdh="http://schemas.microsoft.com/office/word/2020/wordml/sdtdatahash" xmlns:w16sdtfl="http://schemas.microsoft.com/office/word/2024/wordml/sdtformatlock" xmlns:w16se="http://schemas.microsoft.com/office/word/2015/wordml/symex" xmlns:wpg="http://schemas.microsoft.com/office/word/2010/wordprocessingGroup" xmlns:wpi="http://schemas.microsoft.com/office/word/2010/wordprocessingInk" xmlns:wne="http://schemas.microsoft.com/office/word/2006/wordml" xmlns:wps="http://schemas.microsoft.com/office/word/2010/wordprocessingShape" mc:Ignorable="w14 w15 w16se w16cid w16 w16cex w16sdtdh w16sdtfl w16du wp14">
+<w:ftr xmlns:wpc="http://schemas.microsoft.com/office/word/2010/wordprocessingCanvas" xmlns:cx="http://schemas.microsoft.com/office/drawing/2014/chartex" xmlns:cx1="http://schemas.microsoft.com/office/drawing/2015/9/8/chartex" xmlns:cx2="http://schemas.microsoft.com/office/drawing/2015/10/21/chartex" xmlns:cx3="http://schemas.microsoft.com/office/drawing/2016/5/9/chartex" xmlns:cx4="http://schemas.microsoft.com/office/drawing/2016/5/10/chartex" xmlns:cx5="http://schemas.microsoft.com/office/drawing/2016/5/11/chartex" xmlns:cx6="http://schemas.microsoft.com/office/drawing/2016/5/12/chartex" xmlns:cx7="http://schemas.microsoft.com/office/drawing/2016/5/13/chartex" xmlns:cx8="http://schemas.microsoft.com/office/drawing/2016/5/14/chartex" xmlns:mc="http://schemas.openxmlformats.org/markup-compatibility/2006" xmlns:aink="http://schemas.microsoft.com/office/drawing/2016/ink" xmlns:am3d="http://schemas.microsoft.com/office/drawing/2017/model3d" xmlns:o="urn:schemas-microsoft-com:office:office" xmlns:oel="http://schemas.microsoft.com/office/2019/extlst" xmlns:r="http://schemas.openxmlformats.org/officeDocument/2006/relationships" xmlns:m="http://schemas.openxmlformats.org/officeDocument/2006/math" xmlns:v="urn:schemas-microsoft-com:vml" xmlns:wp14="http://schemas.microsoft.com/office/word/2010/wordprocessingDrawing" xmlns:wp="http://schemas.openxmlformats.org/drawingml/2006/wordprocessingDrawing" xmlns:w10="urn:schemas-microsoft-com:office:word" xmlns:w="http://schemas.openxmlformats.org/wordprocessingml/2006/main" xmlns:w14="http://schemas.microsoft.com/office/word/2010/wordml" xmlns:w15="http://schemas.microsoft.com/office/word/2012/wordml" xmlns:w16cex="http://schemas.microsoft.com/office/word/2018/wordml/cex" xmlns:w16cid="http://schemas.microsoft.com/office/word/2016/wordml/cid" xmlns:w16="http://schemas.microsoft.com/office/word/2018/wordml" xmlns:w16du="http://schemas.microsoft.com/office/word/2023/wordml/word16du" xmlns:w16sdtdh="http://schemas.microsoft.com/office/word/2020/wordml/sdtdatahash" xmlns:w16sdtfl="http://schemas.microsoft.com/office/word/2024/wordml/sdtformatlock" xmlns:w16se="http://schemas.microsoft.com/office/word/2015/wordml/symex" xmlns:wpg="http://schemas.microsoft.com/office/word/2010/wordprocessingGroup" xmlns:wpi="http://schemas.microsoft.com/office/word/2010/wordprocessingInk" xmlns:wne="http://schemas.microsoft.com/office/word/2006/wordml" xmlns:wps="http://schemas.microsoft.com/office/word/2010/wordprocessingShape" mc:Ignorable="w14 w15 w16se w16cid w16 w16cex w16sdtdh w16sdtfl w16du wp14">
   <w:p>
     <w:pPr>
       <w:pBdr>
@@ -12268,7 +12632,7 @@
 </file>
 
 <file path=word/footnotes.xml><?xml version="1.0" encoding="utf-8"?>
-<w:footnotes xmlns:wpc="http://schemas.microsoft.com/office/word/2010/wordprocessingCanvas" xmlns:cx="http://schemas.microsoft.com/office/drawing/2014/chartex" xmlns:cx1="http://schemas.microsoft.com/office/drawing/2015/9/8/chartex" xmlns:cx2="http://schemas.microsoft.com/office/drawing/2015/10/21/chartex" xmlns:cx3="http://schemas.microsoft.com/office/drawing/2016/5/9/chartex" xmlns:cx4="http://schemas.microsoft.com/office/drawing/2016/5/10/chartex" xmlns:cx5="http://schemas.microsoft.com/office/drawing/2016/5/11/chartex" xmlns:cx6="http://schemas.microsoft.com/office/drawing/2016/5/12/chartex" xmlns:cx7="http://schemas.microsoft.com/office/drawing/2016/5/13/chartex" xmlns:cx8="http://schemas.microsoft.com/office/drawing/2016/5/14/chartex" xmlns:mc="http://schemas.openxmlformats.org/markup-compatibility/2006" xmlns:aink="http://schemas.microsoft.com/office/drawing/2016/ink" xmlns:am3d="http://schemas.microsoft.com/office/drawing/2017/model3d" xmlns:o="urn:schemas-microsoft-com:office:office" xmlns:oel="http://schemas.microsoft.com/office/2019/extlst" xmlns:r="http://schemas.openxmlformats.org/officeDocument/2006/relationships" xmlns:m="http://schemas.openxmlformats.org/officeDocument/2006/math" xmlns:v="urn:schemas-microsoft-com:vml" xmlns:wp14="http://schemas.microsoft.com/office/word/2010/wordprocessingDrawing" xmlns:wp="http://schemas.openxmlformats.org/drawingml/2006/wordprocessingDrawing" xmlns:w10="urn:schemas-microsoft-com:office:word" xmlns:w="http://schemas.openxmlformats.org/wordprocessingml/2006/main" xmlns:w14="http://schemas.microsoft.com/office/word/2010/wordml" xmlns:w15="http://schemas.microsoft.com/office/word/2012/wordml" xmlns:w16cei="http://schemas.microsoft.com/office/word/2026/wordml/cei" xmlns:w16cex="http://schemas.microsoft.com/office/word/2018/wordml/cex" xmlns:w16cid="http://schemas.microsoft.com/office/word/2016/wordml/cid" xmlns:w16="http://schemas.microsoft.com/office/word/2018/wordml" xmlns:w16du="http://schemas.microsoft.com/office/word/2023/wordml/word16du" xmlns:w16sdtdh="http://schemas.microsoft.com/office/word/2020/wordml/sdtdatahash" xmlns:w16sdtfl="http://schemas.microsoft.com/office/word/2024/wordml/sdtformatlock" xmlns:w16se="http://schemas.microsoft.com/office/word/2015/wordml/symex" xmlns:wpg="http://schemas.microsoft.com/office/word/2010/wordprocessingGroup" xmlns:wpi="http://schemas.microsoft.com/office/word/2010/wordprocessingInk" xmlns:wne="http://schemas.microsoft.com/office/word/2006/wordml" xmlns:wps="http://schemas.microsoft.com/office/word/2010/wordprocessingShape" mc:Ignorable="w14 w15 w16se w16cid w16 w16cex w16sdtdh w16sdtfl w16du wp14">
+<w:footnotes xmlns:wpc="http://schemas.microsoft.com/office/word/2010/wordprocessingCanvas" xmlns:cx="http://schemas.microsoft.com/office/drawing/2014/chartex" xmlns:cx1="http://schemas.microsoft.com/office/drawing/2015/9/8/chartex" xmlns:cx2="http://schemas.microsoft.com/office/drawing/2015/10/21/chartex" xmlns:cx3="http://schemas.microsoft.com/office/drawing/2016/5/9/chartex" xmlns:cx4="http://schemas.microsoft.com/office/drawing/2016/5/10/chartex" xmlns:cx5="http://schemas.microsoft.com/office/drawing/2016/5/11/chartex" xmlns:cx6="http://schemas.microsoft.com/office/drawing/2016/5/12/chartex" xmlns:cx7="http://schemas.microsoft.com/office/drawing/2016/5/13/chartex" xmlns:cx8="http://schemas.microsoft.com/office/drawing/2016/5/14/chartex" xmlns:mc="http://schemas.openxmlformats.org/markup-compatibility/2006" xmlns:aink="http://schemas.microsoft.com/office/drawing/2016/ink" xmlns:am3d="http://schemas.microsoft.com/office/drawing/2017/model3d" xmlns:o="urn:schemas-microsoft-com:office:office" xmlns:oel="http://schemas.microsoft.com/office/2019/extlst" xmlns:r="http://schemas.openxmlformats.org/officeDocument/2006/relationships" xmlns:m="http://schemas.openxmlformats.org/officeDocument/2006/math" xmlns:v="urn:schemas-microsoft-com:vml" xmlns:wp14="http://schemas.microsoft.com/office/word/2010/wordprocessingDrawing" xmlns:wp="http://schemas.openxmlformats.org/drawingml/2006/wordprocessingDrawing" xmlns:w10="urn:schemas-microsoft-com:office:word" xmlns:w="http://schemas.openxmlformats.org/wordprocessingml/2006/main" xmlns:w14="http://schemas.microsoft.com/office/word/2010/wordml" xmlns:w15="http://schemas.microsoft.com/office/word/2012/wordml" xmlns:w16cex="http://schemas.microsoft.com/office/word/2018/wordml/cex" xmlns:w16cid="http://schemas.microsoft.com/office/word/2016/wordml/cid" xmlns:w16="http://schemas.microsoft.com/office/word/2018/wordml" xmlns:w16du="http://schemas.microsoft.com/office/word/2023/wordml/word16du" xmlns:w16sdtdh="http://schemas.microsoft.com/office/word/2020/wordml/sdtdatahash" xmlns:w16sdtfl="http://schemas.microsoft.com/office/word/2024/wordml/sdtformatlock" xmlns:w16se="http://schemas.microsoft.com/office/word/2015/wordml/symex" xmlns:wpg="http://schemas.microsoft.com/office/word/2010/wordprocessingGroup" xmlns:wpi="http://schemas.microsoft.com/office/word/2010/wordprocessingInk" xmlns:wne="http://schemas.microsoft.com/office/word/2006/wordml" xmlns:wps="http://schemas.microsoft.com/office/word/2010/wordprocessingShape" mc:Ignorable="w14 w15 w16se w16cid w16 w16cex w16sdtdh w16sdtfl w16du wp14">
   <w:footnote w:type="separator" w:id="-1">
     <w:p>
       <w:pPr>
@@ -12293,7 +12657,7 @@
 </file>
 
 <file path=word/header1.xml><?xml version="1.0" encoding="utf-8"?>
-<w:hdr xmlns:wpc="http://schemas.microsoft.com/office/word/2010/wordprocessingCanvas" xmlns:cx="http://schemas.microsoft.com/office/drawing/2014/chartex" xmlns:cx1="http://schemas.microsoft.com/office/drawing/2015/9/8/chartex" xmlns:cx2="http://schemas.microsoft.com/office/drawing/2015/10/21/chartex" xmlns:cx3="http://schemas.microsoft.com/office/drawing/2016/5/9/chartex" xmlns:cx4="http://schemas.microsoft.com/office/drawing/2016/5/10/chartex" xmlns:cx5="http://schemas.microsoft.com/office/drawing/2016/5/11/chartex" xmlns:cx6="http://schemas.microsoft.com/office/drawing/2016/5/12/chartex" xmlns:cx7="http://schemas.microsoft.com/office/drawing/2016/5/13/chartex" xmlns:cx8="http://schemas.microsoft.com/office/drawing/2016/5/14/chartex" xmlns:mc="http://schemas.openxmlformats.org/markup-compatibility/2006" xmlns:aink="http://schemas.microsoft.com/office/drawing/2016/ink" xmlns:am3d="http://schemas.microsoft.com/office/drawing/2017/model3d" xmlns:o="urn:schemas-microsoft-com:office:office" xmlns:oel="http://schemas.microsoft.com/office/2019/extlst" xmlns:r="http://schemas.openxmlformats.org/officeDocument/2006/relationships" xmlns:m="http://schemas.openxmlformats.org/officeDocument/2006/math" xmlns:v="urn:schemas-microsoft-com:vml" xmlns:wp14="http://schemas.microsoft.com/office/word/2010/wordprocessingDrawing" xmlns:wp="http://schemas.openxmlformats.org/drawingml/2006/wordprocessingDrawing" xmlns:w10="urn:schemas-microsoft-com:office:word" xmlns:w="http://schemas.openxmlformats.org/wordprocessingml/2006/main" xmlns:w14="http://schemas.microsoft.com/office/word/2010/wordml" xmlns:w15="http://schemas.microsoft.com/office/word/2012/wordml" xmlns:w16cei="http://schemas.microsoft.com/office/word/2026/wordml/cei" xmlns:w16cex="http://schemas.microsoft.com/office/word/2018/wordml/cex" xmlns:w16cid="http://schemas.microsoft.com/office/word/2016/wordml/cid" xmlns:w16="http://schemas.microsoft.com/office/word/2018/wordml" xmlns:w16du="http://schemas.microsoft.com/office/word/2023/wordml/word16du" xmlns:w16sdtdh="http://schemas.microsoft.com/office/word/2020/wordml/sdtdatahash" xmlns:w16sdtfl="http://schemas.microsoft.com/office/word/2024/wordml/sdtformatlock" xmlns:w16se="http://schemas.microsoft.com/office/word/2015/wordml/symex" xmlns:wpg="http://schemas.microsoft.com/office/word/2010/wordprocessingGroup" xmlns:wpi="http://schemas.microsoft.com/office/word/2010/wordprocessingInk" xmlns:wne="http://schemas.microsoft.com/office/word/2006/wordml" xmlns:wps="http://schemas.microsoft.com/office/word/2010/wordprocessingShape" mc:Ignorable="w14 w15 w16se w16cid w16 w16cex w16sdtdh w16sdtfl w16du wp14">
+<w:hdr xmlns:wpc="http://schemas.microsoft.com/office/word/2010/wordprocessingCanvas" xmlns:cx="http://schemas.microsoft.com/office/drawing/2014/chartex" xmlns:cx1="http://schemas.microsoft.com/office/drawing/2015/9/8/chartex" xmlns:cx2="http://schemas.microsoft.com/office/drawing/2015/10/21/chartex" xmlns:cx3="http://schemas.microsoft.com/office/drawing/2016/5/9/chartex" xmlns:cx4="http://schemas.microsoft.com/office/drawing/2016/5/10/chartex" xmlns:cx5="http://schemas.microsoft.com/office/drawing/2016/5/11/chartex" xmlns:cx6="http://schemas.microsoft.com/office/drawing/2016/5/12/chartex" xmlns:cx7="http://schemas.microsoft.com/office/drawing/2016/5/13/chartex" xmlns:cx8="http://schemas.microsoft.com/office/drawing/2016/5/14/chartex" xmlns:mc="http://schemas.openxmlformats.org/markup-compatibility/2006" xmlns:aink="http://schemas.microsoft.com/office/drawing/2016/ink" xmlns:am3d="http://schemas.microsoft.com/office/drawing/2017/model3d" xmlns:o="urn:schemas-microsoft-com:office:office" xmlns:oel="http://schemas.microsoft.com/office/2019/extlst" xmlns:r="http://schemas.openxmlformats.org/officeDocument/2006/relationships" xmlns:m="http://schemas.openxmlformats.org/officeDocument/2006/math" xmlns:v="urn:schemas-microsoft-com:vml" xmlns:wp14="http://schemas.microsoft.com/office/word/2010/wordprocessingDrawing" xmlns:wp="http://schemas.openxmlformats.org/drawingml/2006/wordprocessingDrawing" xmlns:w10="urn:schemas-microsoft-com:office:word" xmlns:w="http://schemas.openxmlformats.org/wordprocessingml/2006/main" xmlns:w14="http://schemas.microsoft.com/office/word/2010/wordml" xmlns:w15="http://schemas.microsoft.com/office/word/2012/wordml" xmlns:w16cex="http://schemas.microsoft.com/office/word/2018/wordml/cex" xmlns:w16cid="http://schemas.microsoft.com/office/word/2016/wordml/cid" xmlns:w16="http://schemas.microsoft.com/office/word/2018/wordml" xmlns:w16du="http://schemas.microsoft.com/office/word/2023/wordml/word16du" xmlns:w16sdtdh="http://schemas.microsoft.com/office/word/2020/wordml/sdtdatahash" xmlns:w16sdtfl="http://schemas.microsoft.com/office/word/2024/wordml/sdtformatlock" xmlns:w16se="http://schemas.microsoft.com/office/word/2015/wordml/symex" xmlns:wpg="http://schemas.microsoft.com/office/word/2010/wordprocessingGroup" xmlns:wpi="http://schemas.microsoft.com/office/word/2010/wordprocessingInk" xmlns:wne="http://schemas.microsoft.com/office/word/2006/wordml" xmlns:wps="http://schemas.microsoft.com/office/word/2010/wordprocessingShape" mc:Ignorable="w14 w15 w16se w16cid w16 w16cex w16sdtdh w16sdtfl w16du wp14">
   <w:p>
     <w:pPr>
       <w:pStyle w:val="Header"/>
@@ -12306,7 +12670,7 @@
 </file>
 
 <file path=word/header2.xml><?xml version="1.0" encoding="utf-8"?>
-<w:hdr xmlns:wpc="http://schemas.microsoft.com/office/word/2010/wordprocessingCanvas" xmlns:cx="http://schemas.microsoft.com/office/drawing/2014/chartex" xmlns:cx1="http://schemas.microsoft.com/office/drawing/2015/9/8/chartex" xmlns:cx2="http://schemas.microsoft.com/office/drawing/2015/10/21/chartex" xmlns:cx3="http://schemas.microsoft.com/office/drawing/2016/5/9/chartex" xmlns:cx4="http://schemas.microsoft.com/office/drawing/2016/5/10/chartex" xmlns:cx5="http://schemas.microsoft.com/office/drawing/2016/5/11/chartex" xmlns:cx6="http://schemas.microsoft.com/office/drawing/2016/5/12/chartex" xmlns:cx7="http://schemas.microsoft.com/office/drawing/2016/5/13/chartex" xmlns:cx8="http://schemas.microsoft.com/office/drawing/2016/5/14/chartex" xmlns:mc="http://schemas.openxmlformats.org/markup-compatibility/2006" xmlns:aink="http://schemas.microsoft.com/office/drawing/2016/ink" xmlns:am3d="http://schemas.microsoft.com/office/drawing/2017/model3d" xmlns:o="urn:schemas-microsoft-com:office:office" xmlns:oel="http://schemas.microsoft.com/office/2019/extlst" xmlns:r="http://schemas.openxmlformats.org/officeDocument/2006/relationships" xmlns:m="http://schemas.openxmlformats.org/officeDocument/2006/math" xmlns:v="urn:schemas-microsoft-com:vml" xmlns:wp14="http://schemas.microsoft.com/office/word/2010/wordprocessingDrawing" xmlns:wp="http://schemas.openxmlformats.org/drawingml/2006/wordprocessingDrawing" xmlns:w10="urn:schemas-microsoft-com:office:word" xmlns:w="http://schemas.openxmlformats.org/wordprocessingml/2006/main" xmlns:w14="http://schemas.microsoft.com/office/word/2010/wordml" xmlns:w15="http://schemas.microsoft.com/office/word/2012/wordml" xmlns:w16cei="http://schemas.microsoft.com/office/word/2026/wordml/cei" xmlns:w16cex="http://schemas.microsoft.com/office/word/2018/wordml/cex" xmlns:w16cid="http://schemas.microsoft.com/office/word/2016/wordml/cid" xmlns:w16="http://schemas.microsoft.com/office/word/2018/wordml" xmlns:w16du="http://schemas.microsoft.com/office/word/2023/wordml/word16du" xmlns:w16sdtdh="http://schemas.microsoft.com/office/word/2020/wordml/sdtdatahash" xmlns:w16sdtfl="http://schemas.microsoft.com/office/word/2024/wordml/sdtformatlock" xmlns:w16se="http://schemas.microsoft.com/office/word/2015/wordml/symex" xmlns:wpg="http://schemas.microsoft.com/office/word/2010/wordprocessingGroup" xmlns:wpi="http://schemas.microsoft.com/office/word/2010/wordprocessingInk" xmlns:wne="http://schemas.microsoft.com/office/word/2006/wordml" xmlns:wps="http://schemas.microsoft.com/office/word/2010/wordprocessingShape" mc:Ignorable="w14 w15 w16se w16cid w16 w16cex w16sdtdh w16sdtfl w16du wp14">
+<w:hdr xmlns:wpc="http://schemas.microsoft.com/office/word/2010/wordprocessingCanvas" xmlns:cx="http://schemas.microsoft.com/office/drawing/2014/chartex" xmlns:cx1="http://schemas.microsoft.com/office/drawing/2015/9/8/chartex" xmlns:cx2="http://schemas.microsoft.com/office/drawing/2015/10/21/chartex" xmlns:cx3="http://schemas.microsoft.com/office/drawing/2016/5/9/chartex" xmlns:cx4="http://schemas.microsoft.com/office/drawing/2016/5/10/chartex" xmlns:cx5="http://schemas.microsoft.com/office/drawing/2016/5/11/chartex" xmlns:cx6="http://schemas.microsoft.com/office/drawing/2016/5/12/chartex" xmlns:cx7="http://schemas.microsoft.com/office/drawing/2016/5/13/chartex" xmlns:cx8="http://schemas.microsoft.com/office/drawing/2016/5/14/chartex" xmlns:mc="http://schemas.openxmlformats.org/markup-compatibility/2006" xmlns:aink="http://schemas.microsoft.com/office/drawing/2016/ink" xmlns:am3d="http://schemas.microsoft.com/office/drawing/2017/model3d" xmlns:o="urn:schemas-microsoft-com:office:office" xmlns:oel="http://schemas.microsoft.com/office/2019/extlst" xmlns:r="http://schemas.openxmlformats.org/officeDocument/2006/relationships" xmlns:m="http://schemas.openxmlformats.org/officeDocument/2006/math" xmlns:v="urn:schemas-microsoft-com:vml" xmlns:wp14="http://schemas.microsoft.com/office/word/2010/wordprocessingDrawing" xmlns:wp="http://schemas.openxmlformats.org/drawingml/2006/wordprocessingDrawing" xmlns:w10="urn:schemas-microsoft-com:office:word" xmlns:w="http://schemas.openxmlformats.org/wordprocessingml/2006/main" xmlns:w14="http://schemas.microsoft.com/office/word/2010/wordml" xmlns:w15="http://schemas.microsoft.com/office/word/2012/wordml" xmlns:w16cex="http://schemas.microsoft.com/office/word/2018/wordml/cex" xmlns:w16cid="http://schemas.microsoft.com/office/word/2016/wordml/cid" xmlns:w16="http://schemas.microsoft.com/office/word/2018/wordml" xmlns:w16du="http://schemas.microsoft.com/office/word/2023/wordml/word16du" xmlns:w16sdtdh="http://schemas.microsoft.com/office/word/2020/wordml/sdtdatahash" xmlns:w16sdtfl="http://schemas.microsoft.com/office/word/2024/wordml/sdtformatlock" xmlns:w16se="http://schemas.microsoft.com/office/word/2015/wordml/symex" xmlns:wpg="http://schemas.microsoft.com/office/word/2010/wordprocessingGroup" xmlns:wpi="http://schemas.microsoft.com/office/word/2010/wordprocessingInk" xmlns:wne="http://schemas.microsoft.com/office/word/2006/wordml" xmlns:wps="http://schemas.microsoft.com/office/word/2010/wordprocessingShape" mc:Ignorable="w14 w15 w16se w16cid w16 w16cex w16sdtdh w16sdtfl w16du wp14">
   <w:p>
     <w:pPr>
       <w:pStyle w:val="Header"/>

</xml_diff>